<commit_message>
Atualização documentação e AGENTS.MD
</commit_message>
<xml_diff>
--- a/Documentos_Ajuda/Preparar_Servidores_original.docx
+++ b/Documentos_Ajuda/Preparar_Servidores_original.docx
@@ -18281,8 +18281,9 @@
           <w:iCs/>
           <w:color w:val="EE0000"/>
         </w:rPr>
-        <w:t>DJANGO_SECURE_SSL_REDIRECT</w:t>
-      </w:r>
+        <w:t xml:space="preserve">DJANGO_SECURE_SSL_REDIRECT está com o valor como 0, pois quem fará o redirecionamento da HTTP para HTTPS será o NGINX + </w:t>
+      </w:r>
+      <w:proofErr w:type="spellStart"/>
       <w:r>
         <w:rPr>
           <w:b/>
@@ -18291,37 +18292,6 @@
           <w:iCs/>
           <w:color w:val="EE0000"/>
         </w:rPr>
-        <w:t xml:space="preserve"> está com o valor como </w:t>
-      </w:r>
-      <w:r>
-        <w:rPr>
-          <w:b/>
-          <w:bCs/>
-          <w:i/>
-          <w:iCs/>
-          <w:color w:val="EE0000"/>
-        </w:rPr>
-        <w:t>0</w:t>
-      </w:r>
-      <w:r>
-        <w:rPr>
-          <w:b/>
-          <w:bCs/>
-          <w:i/>
-          <w:iCs/>
-          <w:color w:val="EE0000"/>
-        </w:rPr>
-        <w:t xml:space="preserve">, pois quem fará o redirecionamento da HTTP para HTTPS será o NGINX + </w:t>
-      </w:r>
-      <w:proofErr w:type="spellStart"/>
-      <w:r>
-        <w:rPr>
-          <w:b/>
-          <w:bCs/>
-          <w:i/>
-          <w:iCs/>
-          <w:color w:val="EE0000"/>
-        </w:rPr>
         <w:t>CloudFlare</w:t>
       </w:r>
       <w:proofErr w:type="spellEnd"/>
@@ -18397,11 +18367,11 @@
       </w:r>
       <w:proofErr w:type="spellEnd"/>
       <w:r>
-        <w:t xml:space="preserve"> c</w:t>
-      </w:r>
-      <w:proofErr w:type="spellStart"/>
-      <w:r>
-        <w:t>ertbot</w:t>
+        <w:t xml:space="preserve"> </w:t>
+      </w:r>
+      <w:proofErr w:type="spellStart"/>
+      <w:r>
+        <w:t>certbot</w:t>
       </w:r>
       <w:proofErr w:type="spellEnd"/>
       <w:r>
@@ -22867,6 +22837,7 @@
         </w:rPr>
         <w:t xml:space="preserve">. </w:t>
       </w:r>
+      <w:bookmarkStart w:id="0" w:name="_Hlk219005381"/>
       <w:r>
         <w:rPr>
           <w:b/>
@@ -22931,20 +22902,29 @@
         </w:rPr>
         <w:t>:</w:t>
       </w:r>
-    </w:p>
-    <w:p>
-      <w:pPr>
-        <w:rPr>
-          <w:i/>
-          <w:iCs/>
-        </w:rPr>
-      </w:pPr>
-      <w:r>
-        <w:rPr>
-          <w:i/>
-          <w:iCs/>
-        </w:rPr>
-        <w:t xml:space="preserve">ATENÇÃO: desativar o proxy da </w:t>
+      <w:bookmarkEnd w:id="0"/>
+    </w:p>
+    <w:p>
+      <w:pPr>
+        <w:rPr>
+          <w:i/>
+          <w:iCs/>
+        </w:rPr>
+      </w:pPr>
+      <w:r>
+        <w:rPr>
+          <w:i/>
+          <w:iCs/>
+        </w:rPr>
+        <w:t xml:space="preserve">ATENÇÃO: desativar </w:t>
+      </w:r>
+      <w:bookmarkStart w:id="1" w:name="_Hlk219005429"/>
+      <w:r>
+        <w:rPr>
+          <w:i/>
+          <w:iCs/>
+        </w:rPr>
+        <w:t xml:space="preserve">o proxy da </w:t>
       </w:r>
       <w:proofErr w:type="spellStart"/>
       <w:r>
@@ -22960,7 +22940,15 @@
           <w:i/>
           <w:iCs/>
         </w:rPr>
-        <w:t xml:space="preserve"> (nuvem cinza) por alguns minutos para o desafio HTTP-01 funcionar.</w:t>
+        <w:t xml:space="preserve"> (nuvem cinza) por alguns minutos para o desafio HTTP-01 funcionar</w:t>
+      </w:r>
+      <w:bookmarkEnd w:id="1"/>
+      <w:r>
+        <w:rPr>
+          <w:i/>
+          <w:iCs/>
+        </w:rPr>
+        <w:t>.</w:t>
       </w:r>
     </w:p>
     <w:p>
@@ -23318,6 +23306,7 @@
         <w:rPr>
           <w:i/>
           <w:iCs/>
+          <w:u w:val="single"/>
         </w:rPr>
         <w:t>sudo</w:t>
       </w:r>
@@ -23596,11 +23585,105 @@
           <w:color w:val="C00000"/>
         </w:rPr>
       </w:pPr>
+      <w:r>
+        <w:rPr>
+          <w:b/>
+          <w:bCs/>
+          <w:i/>
+          <w:iCs/>
+          <w:color w:val="C00000"/>
+        </w:rPr>
+        <w:t xml:space="preserve">18. </w:t>
+      </w:r>
+      <w:r>
+        <w:rPr>
+          <w:b/>
+          <w:bCs/>
+          <w:i/>
+          <w:iCs/>
+          <w:color w:val="C00000"/>
+        </w:rPr>
+        <w:t>Testar a renovação automática</w:t>
+      </w:r>
+      <w:r>
+        <w:rPr>
+          <w:b/>
+          <w:bCs/>
+          <w:i/>
+          <w:iCs/>
+          <w:color w:val="C00000"/>
+        </w:rPr>
+        <w:t>:</w:t>
+      </w:r>
     </w:p>
     <w:p>
       <w:pPr>
         <w:ind w:left="360"/>
         <w:rPr>
+          <w:i/>
+          <w:iCs/>
+        </w:rPr>
+      </w:pPr>
+      <w:proofErr w:type="spellStart"/>
+      <w:r>
+        <w:rPr>
+          <w:i/>
+          <w:iCs/>
+        </w:rPr>
+        <w:t>certbot</w:t>
+      </w:r>
+      <w:proofErr w:type="spellEnd"/>
+      <w:r>
+        <w:rPr>
+          <w:i/>
+          <w:iCs/>
+        </w:rPr>
+        <w:t xml:space="preserve"> </w:t>
+      </w:r>
+      <w:proofErr w:type="spellStart"/>
+      <w:r>
+        <w:rPr>
+          <w:i/>
+          <w:iCs/>
+        </w:rPr>
+        <w:t>renew</w:t>
+      </w:r>
+      <w:proofErr w:type="spellEnd"/>
+      <w:r>
+        <w:rPr>
+          <w:i/>
+          <w:iCs/>
+        </w:rPr>
+        <w:t xml:space="preserve"> --</w:t>
+      </w:r>
+      <w:proofErr w:type="spellStart"/>
+      <w:r>
+        <w:rPr>
+          <w:i/>
+          <w:iCs/>
+        </w:rPr>
+        <w:t>dry-run</w:t>
+      </w:r>
+      <w:proofErr w:type="spellEnd"/>
+    </w:p>
+    <w:p>
+      <w:pPr>
+        <w:ind w:left="360"/>
+        <w:rPr>
+          <w:u w:val="single"/>
+        </w:rPr>
+      </w:pPr>
+      <w:r>
+        <w:rPr>
+          <w:u w:val="single"/>
+        </w:rPr>
+        <w:t>Se aparecer OK, está perfeito.</w:t>
+      </w:r>
+    </w:p>
+    <w:p>
+      <w:pPr>
+        <w:ind w:left="360"/>
+        <w:rPr>
           <w:b/>
           <w:bCs/>
           <w:i/>
@@ -23616,7 +23699,18 @@
           <w:iCs/>
           <w:color w:val="C00000"/>
         </w:rPr>
-        <w:t>18</w:t>
+        <w:lastRenderedPageBreak/>
+        <w:t>1</w:t>
+      </w:r>
+      <w:r>
+        <w:rPr>
+          <w:b/>
+          <w:bCs/>
+          <w:i/>
+          <w:iCs/>
+          <w:color w:val="C00000"/>
+        </w:rPr>
+        <w:t>9</w:t>
       </w:r>
       <w:r>
         <w:rPr>
@@ -23738,7 +23832,6 @@
           <w:i/>
           <w:iCs/>
         </w:rPr>
-        <w:lastRenderedPageBreak/>
         <w:t>cd</w:t>
       </w:r>
       <w:proofErr w:type="spellEnd"/>

</xml_diff>